<commit_message>
feat(palier): raise the first tier to 18 000 € (17 570 € budget)
- Mobilité solidaire 9 700 € -> 11 100 €: used 7-seater 8 000 €, registration
  and livery 600 €, passenger insurance 1 000 €, fuel 1 000 €, upkeep 500 €.
- Liaison & sécurité becomes Liaison, sécurité & assurance, 980 € -> 1 330 €:
  adds the association's RC multirisque and legal protection (350 €).
- Corporate sponsorships: vehicle 11 000 €, liaison 1 300 €.
- FUNDING_GOAL_EUR default 18000; site, llms.txt, flyers, rescrit and
  governance sources updated; PDFs and the 5 affected docx regenerated.

Co-Authored-By: Claude Opus 5.5 <noreply@anthropic.com>
</commit_message>
<xml_diff>
--- a/documents/gouvernance/word/00_Sommaire_et_suivi.docx
+++ b/documents/gouvernance/word/00_Sommaire_et_suivi.docx
@@ -113,7 +113,7 @@
           <w:sz w:val="17"/>
           <w:szCs w:val="17"/>
         </w:rPr>
-        <w:t xml:space="preserve">Version 1.1 · octobre 2026 · Mise à jour : premier palier de 16 000 € · Chaque document existe en Word (modifiable) et en PDF</w:t>
+        <w:t xml:space="preserve">Version 1.1 · octobre 2026 · Mise à jour : premier palier de 18 000 € · Chaque document existe en Word (modifiable) et en PDF</w:t>
       </w:r>
     </w:p>
     <w:p>
@@ -3926,14 +3926,14 @@
                 <w:sz w:val="18"/>
                 <w:szCs w:val="18"/>
               </w:rPr>
-              <w:t xml:space="preserve">premier palier de 16 000 €</w:t>
-            </w:r>
-            <w:r>
-              <w:rPr>
-                <w:sz w:val="18"/>
-                <w:szCs w:val="18"/>
-              </w:rPr>
-              <w:t xml:space="preserve"> (budget chiffré 15 820 €) : véhicule 7 places (9 700 €), Fonds de Premier Secours Social (4 000 €), équipe de 4 bénévoles (1 140 €), liaison et sécurité (980 €). Le dispositif n'est activé qu'une fois ce palier réuni.</w:t>
+              <w:t xml:space="preserve">premier palier de 18 000 €</w:t>
+            </w:r>
+            <w:r>
+              <w:rPr>
+                <w:sz w:val="18"/>
+                <w:szCs w:val="18"/>
+              </w:rPr>
+              <w:t xml:space="preserve"> (budget chiffré 17 570 €) : véhicule 7 places (11 100 €), Fonds de Premier Secours Social (4 000 €), équipe de 4 bénévoles (1 140 €), liaison, sécurité et assurance (1 330 €). Le dispositif n'est activé qu'une fois ce palier réuni.</w:t>
             </w:r>
           </w:p>
         </w:tc>
@@ -5991,14 +5991,77 @@
         <w:szCs w:val="13"/>
       </w:rPr>
       <w:t xml:space="preserve">	p. </w:t>
+    </w:r>
+    <w:r>
+      <w:rPr>
+        <w:color w:val="574A66"/>
+        <w:sz w:val="13"/>
+        <w:szCs w:val="13"/>
+      </w:rPr>
       <w:fldChar w:fldCharType="begin"/>
+    </w:r>
+    <w:r>
+      <w:rPr>
+        <w:color w:val="574A66"/>
+        <w:sz w:val="13"/>
+        <w:szCs w:val="13"/>
+      </w:rPr>
       <w:instrText xml:space="preserve">PAGE</w:instrText>
+    </w:r>
+    <w:r>
+      <w:rPr>
+        <w:color w:val="574A66"/>
+        <w:sz w:val="13"/>
+        <w:szCs w:val="13"/>
+      </w:rPr>
       <w:fldChar w:fldCharType="separate"/>
+    </w:r>
+    <w:r>
+      <w:rPr>
+        <w:color w:val="574A66"/>
+        <w:sz w:val="13"/>
+        <w:szCs w:val="13"/>
+      </w:rPr>
       <w:fldChar w:fldCharType="end"/>
+    </w:r>
+    <w:r>
+      <w:rPr>
+        <w:color w:val="574A66"/>
+        <w:sz w:val="13"/>
+        <w:szCs w:val="13"/>
+      </w:rPr>
       <w:t xml:space="preserve"> / </w:t>
+    </w:r>
+    <w:r>
+      <w:rPr>
+        <w:color w:val="574A66"/>
+        <w:sz w:val="13"/>
+        <w:szCs w:val="13"/>
+      </w:rPr>
       <w:fldChar w:fldCharType="begin"/>
+    </w:r>
+    <w:r>
+      <w:rPr>
+        <w:color w:val="574A66"/>
+        <w:sz w:val="13"/>
+        <w:szCs w:val="13"/>
+      </w:rPr>
       <w:instrText xml:space="preserve">NUMPAGES</w:instrText>
+    </w:r>
+    <w:r>
+      <w:rPr>
+        <w:color w:val="574A66"/>
+        <w:sz w:val="13"/>
+        <w:szCs w:val="13"/>
+      </w:rPr>
       <w:fldChar w:fldCharType="separate"/>
+    </w:r>
+    <w:r>
+      <w:rPr>
+        <w:color w:val="574A66"/>
+        <w:sz w:val="13"/>
+        <w:szCs w:val="13"/>
+      </w:rPr>
       <w:fldChar w:fldCharType="end"/>
     </w:r>
   </w:p>

</xml_diff>

<commit_message>
feat(brand): roll out the interlocking-hands logo everywhere
Adopt the logo delivered in documents/textile/source/ as the single source
of truth. generate.py now reuses its vector paths (curves and lettering kept
as drawn) to build the 4 lockups x 3 colorways, the site logo.svg and, with
--exports, the PDF/EPS files, PNG/ICO icons and logo-symbole*.png.

The brand ink moves to the logo's #4F0D70 and the logo's lilac #C384E0 is
added (decoration, text on ink only); CLAUDE.md, README and every page,
print template and governance document follow. Word files are patched in
place (logo image + ink color) so edits made in Word are preserved, then
re-exported to PDF; flyers, cards, textile sheet and mockups are re-exported.

The new mark is finer than the old one: the textile sheet thresholds are
re-measured (chest flex now uses the symbol alone, 45 mm minimum).

Co-Authored-By: Claude Opus 5.5 <noreply@anthropic.com>
</commit_message>
<xml_diff>
--- a/documents/gouvernance/word/00_Sommaire_et_suivi.docx
+++ b/documents/gouvernance/word/00_Sommaire_et_suivi.docx
@@ -51,7 +51,7 @@
           <w:rFonts w:ascii="Arial" w:cs="Arial" w:eastAsia="Arial" w:hAnsi="Arial"/>
           <w:b/>
           <w:bCs/>
-          <w:color w:val="2A0E45"/>
+          <w:color w:val="4F0D70"/>
           <w:sz w:val="30"/>
           <w:szCs w:val="30"/>
         </w:rPr>
@@ -93,7 +93,7 @@
         <w:rPr>
           <w:b/>
           <w:bCs/>
-          <w:color w:val="2A0E45"/>
+          <w:color w:val="4F0D70"/>
           <w:sz w:val="40"/>
           <w:szCs w:val="40"/>
         </w:rPr>
@@ -229,7 +229,7 @@
               <w:bottom w:val="single" w:color="D9CCEF" w:sz="4"/>
               <w:right w:val="single" w:color="D9CCEF" w:sz="4"/>
             </w:tcBorders>
-            <w:shd w:fill="2A0E45" w:color="auto" w:val="clear"/>
+            <w:shd w:fill="4F0D70" w:color="auto" w:val="clear"/>
             <w:tcMar>
               <w:top w:type="dxa" w:w="60"/>
               <w:left w:type="dxa" w:w="100"/>
@@ -263,7 +263,7 @@
               <w:bottom w:val="single" w:color="D9CCEF" w:sz="4"/>
               <w:right w:val="single" w:color="D9CCEF" w:sz="4"/>
             </w:tcBorders>
-            <w:shd w:fill="2A0E45" w:color="auto" w:val="clear"/>
+            <w:shd w:fill="4F0D70" w:color="auto" w:val="clear"/>
             <w:tcMar>
               <w:top w:type="dxa" w:w="60"/>
               <w:left w:type="dxa" w:w="100"/>
@@ -297,7 +297,7 @@
               <w:bottom w:val="single" w:color="D9CCEF" w:sz="4"/>
               <w:right w:val="single" w:color="D9CCEF" w:sz="4"/>
             </w:tcBorders>
-            <w:shd w:fill="2A0E45" w:color="auto" w:val="clear"/>
+            <w:shd w:fill="4F0D70" w:color="auto" w:val="clear"/>
             <w:tcMar>
               <w:top w:type="dxa" w:w="60"/>
               <w:left w:type="dxa" w:w="100"/>
@@ -331,7 +331,7 @@
               <w:bottom w:val="single" w:color="D9CCEF" w:sz="4"/>
               <w:right w:val="single" w:color="D9CCEF" w:sz="4"/>
             </w:tcBorders>
-            <w:shd w:fill="2A0E45" w:color="auto" w:val="clear"/>
+            <w:shd w:fill="4F0D70" w:color="auto" w:val="clear"/>
             <w:tcMar>
               <w:top w:type="dxa" w:w="60"/>
               <w:left w:type="dxa" w:w="100"/>
@@ -365,7 +365,7 @@
               <w:bottom w:val="single" w:color="D9CCEF" w:sz="4"/>
               <w:right w:val="single" w:color="D9CCEF" w:sz="4"/>
             </w:tcBorders>
-            <w:shd w:fill="2A0E45" w:color="auto" w:val="clear"/>
+            <w:shd w:fill="4F0D70" w:color="auto" w:val="clear"/>
             <w:tcMar>
               <w:top w:type="dxa" w:w="60"/>
               <w:left w:type="dxa" w:w="100"/>
@@ -399,7 +399,7 @@
               <w:bottom w:val="single" w:color="D9CCEF" w:sz="4"/>
               <w:right w:val="single" w:color="D9CCEF" w:sz="4"/>
             </w:tcBorders>
-            <w:shd w:fill="2A0E45" w:color="auto" w:val="clear"/>
+            <w:shd w:fill="4F0D70" w:color="auto" w:val="clear"/>
             <w:tcMar>
               <w:top w:type="dxa" w:w="60"/>
               <w:left w:type="dxa" w:w="100"/>
@@ -2161,7 +2161,7 @@
               <w:bottom w:val="single" w:color="D9CCEF" w:sz="4"/>
               <w:right w:val="single" w:color="D9CCEF" w:sz="4"/>
             </w:tcBorders>
-            <w:shd w:fill="2A0E45" w:color="auto" w:val="clear"/>
+            <w:shd w:fill="4F0D70" w:color="auto" w:val="clear"/>
             <w:tcMar>
               <w:top w:type="dxa" w:w="60"/>
               <w:left w:type="dxa" w:w="100"/>
@@ -2195,7 +2195,7 @@
               <w:bottom w:val="single" w:color="D9CCEF" w:sz="4"/>
               <w:right w:val="single" w:color="D9CCEF" w:sz="4"/>
             </w:tcBorders>
-            <w:shd w:fill="2A0E45" w:color="auto" w:val="clear"/>
+            <w:shd w:fill="4F0D70" w:color="auto" w:val="clear"/>
             <w:tcMar>
               <w:top w:type="dxa" w:w="60"/>
               <w:left w:type="dxa" w:w="100"/>
@@ -2229,7 +2229,7 @@
               <w:bottom w:val="single" w:color="D9CCEF" w:sz="4"/>
               <w:right w:val="single" w:color="D9CCEF" w:sz="4"/>
             </w:tcBorders>
-            <w:shd w:fill="2A0E45" w:color="auto" w:val="clear"/>
+            <w:shd w:fill="4F0D70" w:color="auto" w:val="clear"/>
             <w:tcMar>
               <w:top w:type="dxa" w:w="60"/>
               <w:left w:type="dxa" w:w="100"/>
@@ -2263,7 +2263,7 @@
               <w:bottom w:val="single" w:color="D9CCEF" w:sz="4"/>
               <w:right w:val="single" w:color="D9CCEF" w:sz="4"/>
             </w:tcBorders>
-            <w:shd w:fill="2A0E45" w:color="auto" w:val="clear"/>
+            <w:shd w:fill="4F0D70" w:color="auto" w:val="clear"/>
             <w:tcMar>
               <w:top w:type="dxa" w:w="60"/>
               <w:left w:type="dxa" w:w="100"/>
@@ -2297,7 +2297,7 @@
               <w:bottom w:val="single" w:color="D9CCEF" w:sz="4"/>
               <w:right w:val="single" w:color="D9CCEF" w:sz="4"/>
             </w:tcBorders>
-            <w:shd w:fill="2A0E45" w:color="auto" w:val="clear"/>
+            <w:shd w:fill="4F0D70" w:color="auto" w:val="clear"/>
             <w:tcMar>
               <w:top w:type="dxa" w:w="60"/>
               <w:left w:type="dxa" w:w="100"/>
@@ -2331,7 +2331,7 @@
               <w:bottom w:val="single" w:color="D9CCEF" w:sz="4"/>
               <w:right w:val="single" w:color="D9CCEF" w:sz="4"/>
             </w:tcBorders>
-            <w:shd w:fill="2A0E45" w:color="auto" w:val="clear"/>
+            <w:shd w:fill="4F0D70" w:color="auto" w:val="clear"/>
             <w:tcMar>
               <w:top w:type="dxa" w:w="60"/>
               <w:left w:type="dxa" w:w="100"/>
@@ -3977,7 +3977,7 @@
               <w:bottom w:val="single" w:color="D9CCEF" w:sz="4"/>
               <w:right w:val="single" w:color="D9CCEF" w:sz="4"/>
             </w:tcBorders>
-            <w:shd w:fill="2A0E45" w:color="auto" w:val="clear"/>
+            <w:shd w:fill="4F0D70" w:color="auto" w:val="clear"/>
             <w:tcMar>
               <w:top w:type="dxa" w:w="60"/>
               <w:left w:type="dxa" w:w="100"/>
@@ -4011,7 +4011,7 @@
               <w:bottom w:val="single" w:color="D9CCEF" w:sz="4"/>
               <w:right w:val="single" w:color="D9CCEF" w:sz="4"/>
             </w:tcBorders>
-            <w:shd w:fill="2A0E45" w:color="auto" w:val="clear"/>
+            <w:shd w:fill="4F0D70" w:color="auto" w:val="clear"/>
             <w:tcMar>
               <w:top w:type="dxa" w:w="60"/>
               <w:left w:type="dxa" w:w="100"/>
@@ -4045,7 +4045,7 @@
               <w:bottom w:val="single" w:color="D9CCEF" w:sz="4"/>
               <w:right w:val="single" w:color="D9CCEF" w:sz="4"/>
             </w:tcBorders>
-            <w:shd w:fill="2A0E45" w:color="auto" w:val="clear"/>
+            <w:shd w:fill="4F0D70" w:color="auto" w:val="clear"/>
             <w:tcMar>
               <w:top w:type="dxa" w:w="60"/>
               <w:left w:type="dxa" w:w="100"/>
@@ -4079,7 +4079,7 @@
               <w:bottom w:val="single" w:color="D9CCEF" w:sz="4"/>
               <w:right w:val="single" w:color="D9CCEF" w:sz="4"/>
             </w:tcBorders>
-            <w:shd w:fill="2A0E45" w:color="auto" w:val="clear"/>
+            <w:shd w:fill="4F0D70" w:color="auto" w:val="clear"/>
             <w:tcMar>
               <w:top w:type="dxa" w:w="60"/>
               <w:left w:type="dxa" w:w="100"/>
@@ -4113,7 +4113,7 @@
               <w:bottom w:val="single" w:color="D9CCEF" w:sz="4"/>
               <w:right w:val="single" w:color="D9CCEF" w:sz="4"/>
             </w:tcBorders>
-            <w:shd w:fill="2A0E45" w:color="auto" w:val="clear"/>
+            <w:shd w:fill="4F0D70" w:color="auto" w:val="clear"/>
             <w:tcMar>
               <w:top w:type="dxa" w:w="60"/>
               <w:left w:type="dxa" w:w="100"/>
@@ -4147,7 +4147,7 @@
               <w:bottom w:val="single" w:color="D9CCEF" w:sz="4"/>
               <w:right w:val="single" w:color="D9CCEF" w:sz="4"/>
             </w:tcBorders>
-            <w:shd w:fill="2A0E45" w:color="auto" w:val="clear"/>
+            <w:shd w:fill="4F0D70" w:color="auto" w:val="clear"/>
             <w:tcMar>
               <w:top w:type="dxa" w:w="60"/>
               <w:left w:type="dxa" w:w="100"/>
@@ -6418,7 +6418,7 @@
       <w:rFonts w:ascii="Arial" w:cs="Arial" w:eastAsia="Arial" w:hAnsi="Arial"/>
       <w:b/>
       <w:bCs/>
-      <w:color w:val="2A0E45"/>
+      <w:color w:val="4F0D70"/>
       <w:sz w:val="28"/>
       <w:szCs w:val="28"/>
     </w:rPr>
@@ -6456,7 +6456,7 @@
       <w:rFonts w:ascii="Arial" w:cs="Arial" w:eastAsia="Arial" w:hAnsi="Arial"/>
       <w:b/>
       <w:bCs/>
-      <w:color w:val="2A0E45"/>
+      <w:color w:val="4F0D70"/>
       <w:sz w:val="20"/>
       <w:szCs w:val="20"/>
     </w:rPr>

</xml_diff>